<commit_message>
Migrate AI extraction to OpenAI and add SAP synthesis
</commit_message>
<xml_diff>
--- a/AI_Extract_User_Manual.docx
+++ b/AI_Extract_User_Manual.docx
@@ -48,7 +48,7 @@
         </w:rPr>
         <w:t>Search PubMed/PMC, retrieve full text and supplementary files,</w:t>
         <w:br/>
-        <w:t>and extract structured biomedical evidence with Gemini AI</w:t>
+        <w:t>and extract structured health research evidence with OpenAI GPT</w:t>
       </w:r>
     </w:p>
     <w:tbl>
@@ -141,9 +141,7 @@
       </w:r>
     </w:p>
     <w:p>
-      <w:r>
-        <w:br w:type="page"/>
-      </w:r>
+      <w:r/>
     </w:p>
     <w:p>
       <w:pPr>
@@ -728,9 +726,7 @@
       </w:pPr>
     </w:p>
     <w:p>
-      <w:r>
-        <w:br w:type="page"/>
-      </w:r>
+      <w:r/>
     </w:p>
     <w:p>
       <w:pPr>
@@ -757,7 +753,7 @@
           <w:color w:val="000000"/>
           <w:sz w:val="22"/>
         </w:rPr>
-        <w:t>AI Extract is a local web application for biomedical literature discovery and evidence extraction. A user enters a medical research question. The system normalizes the wording, searches PubMed and PMC, returns papers with PMC full text, and can run Gemini-powered extraction on selected papers.</w:t>
+        <w:t>AI Extract is a local web application for medical, clinical, healthcare, and life-sciences research literature discovery and evidence extraction. A user enters a medical research question. The system normalizes the wording, searches PubMed and PMC, returns papers with PMC full text, and can run OpenAI GPT-powered extraction on selected papers.</w:t>
       </w:r>
     </w:p>
     <w:p>
@@ -969,9 +965,7 @@
       </w:r>
     </w:p>
     <w:p>
-      <w:r>
-        <w:br w:type="page"/>
-      </w:r>
+      <w:r/>
     </w:p>
     <w:p>
       <w:pPr>
@@ -1280,9 +1274,7 @@
       </w:pPr>
     </w:p>
     <w:p>
-      <w:r>
-        <w:br w:type="page"/>
-      </w:r>
+      <w:r/>
     </w:p>
     <w:p>
       <w:pPr>
@@ -2519,9 +2511,7 @@
       </w:r>
     </w:p>
     <w:p>
-      <w:r>
-        <w:br w:type="page"/>
-      </w:r>
+      <w:r/>
     </w:p>
     <w:p>
       <w:pPr>
@@ -2548,7 +2538,7 @@
           <w:color w:val="000000"/>
           <w:sz w:val="22"/>
         </w:rPr>
-        <w:t>Use disease, population, treatment/exposure, and outcome terms when possible. The normalizer may convert common language to biomedical search terms.</w:t>
+        <w:t>Use disease, population, treatment/exposure, and outcome terms when possible. The normalizer may convert common language to medical, clinical, healthcare, and life-sciences research search terms.</w:t>
       </w:r>
     </w:p>
     <w:tbl>
@@ -3262,7 +3252,7 @@
                 <w:color w:val="000000"/>
                 <w:sz w:val="21"/>
               </w:rPr>
-              <w:t>Each AI-analyzed paper can make several Gemini requests. Use a small Papers to analyze value until you understand time and API usage.</w:t>
+              <w:t>Each AI-analyzed paper can make several OpenAI API requests. Use a small Papers to analyze value until you understand time and API usage.</w:t>
             </w:r>
           </w:p>
         </w:tc>
@@ -3274,9 +3264,7 @@
       </w:pPr>
     </w:p>
     <w:p>
-      <w:r>
-        <w:br w:type="page"/>
-      </w:r>
+      <w:r/>
     </w:p>
     <w:p>
       <w:pPr>
@@ -3831,9 +3819,7 @@
       </w:pPr>
     </w:p>
     <w:p>
-      <w:r>
-        <w:br w:type="page"/>
-      </w:r>
+      <w:r/>
     </w:p>
     <w:p>
       <w:pPr>
@@ -3880,7 +3866,7 @@
           <w:color w:val="000000"/>
           <w:sz w:val="22"/>
         </w:rPr>
-        <w:t>Internet access to NCBI/PubMed/PMC, Europe PMC or publisher sources for supplements, Google Gemini, and the external font/icon CDNs used by the interface.</w:t>
+        <w:t>Internet access to NCBI/PubMed/PMC, Europe PMC or publisher sources for supplements, OpenAI GPT, and the external font/icon CDNs used by the interface.</w:t>
       </w:r>
     </w:p>
     <w:p>
@@ -3912,7 +3898,7 @@
           <w:color w:val="000000"/>
           <w:sz w:val="22"/>
         </w:rPr>
-        <w:t>A Gemini API key is required for query normalization and AI extraction.</w:t>
+        <w:t>A OpenAI API key is required for query normalization and AI extraction.</w:t>
       </w:r>
     </w:p>
     <w:p>
@@ -4339,7 +4325,7 @@
                 <w:color w:val="000000"/>
                 <w:sz w:val="19"/>
               </w:rPr>
-              <w:t>GEMINI_API_KEY</w:t>
+              <w:t>OPENAI_API_KEY</w:t>
             </w:r>
           </w:p>
         </w:tc>
@@ -4366,7 +4352,7 @@
                 <w:color w:val="000000"/>
                 <w:sz w:val="19"/>
               </w:rPr>
-              <w:t>Gemini authentication for normalization and AI extraction</w:t>
+              <w:t>OpenAI authentication for normalization and AI extraction</w:t>
             </w:r>
           </w:p>
         </w:tc>
@@ -4712,9 +4698,7 @@
       </w:pPr>
     </w:p>
     <w:p>
-      <w:r>
-        <w:br w:type="page"/>
-      </w:r>
+      <w:r/>
     </w:p>
     <w:p>
       <w:pPr>
@@ -5045,7 +5029,7 @@
                 <w:color w:val="000000"/>
                 <w:sz w:val="19"/>
               </w:rPr>
-              <w:t>google-genai</w:t>
+              <w:t>openai</w:t>
             </w:r>
           </w:p>
         </w:tc>
@@ -5225,9 +5209,7 @@
       </w:pPr>
     </w:p>
     <w:p>
-      <w:r>
-        <w:br w:type="page"/>
-      </w:r>
+      <w:r/>
     </w:p>
     <w:p>
       <w:pPr>
@@ -5480,9 +5462,7 @@
       </w:pPr>
     </w:p>
     <w:p>
-      <w:r>
-        <w:br w:type="page"/>
-      </w:r>
+      <w:r/>
     </w:p>
     <w:p>
       <w:pPr>
@@ -5549,7 +5529,7 @@
           <w:color w:val="000000"/>
           <w:sz w:val="22"/>
         </w:rPr>
-        <w:t>Gemini normalizes the query and may return abbreviation choices.</w:t>
+        <w:t>OpenAI GPT normalizes the query and may return abbreviation choices.</w:t>
       </w:r>
     </w:p>
     <w:p>
@@ -6095,7 +6075,7 @@
                 <w:color w:val="000000"/>
                 <w:sz w:val="19"/>
               </w:rPr>
-              <w:t>Gemini client and normalization, relevance, SLR, code, method, outcome/country agents</w:t>
+              <w:t>OpenAI client and normalization, relevance, SLR, code, method, outcome/country agents</w:t>
             </w:r>
           </w:p>
         </w:tc>
@@ -6834,9 +6814,7 @@
       </w:pPr>
     </w:p>
     <w:p>
-      <w:r>
-        <w:br w:type="page"/>
-      </w:r>
+      <w:r/>
     </w:p>
     <w:p>
       <w:pPr>
@@ -7166,7 +7144,7 @@
                 <w:color w:val="000000"/>
                 <w:sz w:val="19"/>
               </w:rPr>
-              <w:t>Missing/invalid Gemini key, network issue, or Gemini error</w:t>
+              <w:t>Missing/invalid OpenAI key, network issue, or OpenAI API error</w:t>
             </w:r>
           </w:p>
         </w:tc>
@@ -7193,7 +7171,7 @@
                 <w:color w:val="000000"/>
                 <w:sz w:val="19"/>
               </w:rPr>
-              <w:t>Check GEMINI_API_KEY and internet access; restart after editing .env.</w:t>
+              <w:t>Check OPENAI_API_KEY and internet access; restart after editing .env.</w:t>
             </w:r>
           </w:p>
         </w:tc>
@@ -7276,7 +7254,7 @@
                 <w:color w:val="000000"/>
                 <w:sz w:val="19"/>
               </w:rPr>
-              <w:t>Add disease, treatment, population, outcome, or biomedical terms.</w:t>
+              <w:t>Add disease, treatment, population, outcome, or medical, clinical, healthcare, and life-sciences research terms.</w:t>
             </w:r>
           </w:p>
         </w:tc>
@@ -8024,9 +8002,7 @@
       </w:r>
     </w:p>
     <w:p>
-      <w:r>
-        <w:br w:type="page"/>
-      </w:r>
+      <w:r/>
     </w:p>
     <w:p>
       <w:pPr>
@@ -8065,7 +8041,7 @@
           <w:color w:val="000000"/>
           <w:sz w:val="22"/>
         </w:rPr>
-        <w:t>Queries and extracted paper text may be sent to Google Gemini when normalization or AI extraction is used. Review your organization’s data-processing rules.</w:t>
+        <w:t>Queries and extracted paper text may be sent to OpenAI GPT when normalization or AI extraction is used. Review your organization’s data-processing rules.</w:t>
       </w:r>
     </w:p>
     <w:p>
@@ -8207,9 +8183,7 @@
       </w:pPr>
     </w:p>
     <w:p>
-      <w:r>
-        <w:br w:type="page"/>
-      </w:r>
+      <w:r/>
     </w:p>
     <w:p>
       <w:pPr>
@@ -9588,9 +9562,7 @@
       </w:pPr>
     </w:p>
     <w:p>
-      <w:r>
-        <w:br w:type="page"/>
-      </w:r>
+      <w:r/>
     </w:p>
     <w:p>
       <w:pPr>
@@ -9685,7 +9657,7 @@
           <w:color w:val="000000"/>
           <w:sz w:val="22"/>
         </w:rPr>
-        <w:t>Set GEMINI_API_KEY.</w:t>
+        <w:t>Set OPENAI_API_KEY.</w:t>
       </w:r>
     </w:p>
     <w:p>
@@ -9965,7 +9937,7 @@
         <w:color w:val="666666"/>
         <w:sz w:val="17"/>
       </w:rPr>
-      <w:t>Local biomedical evidence extraction platform  |  Version 2.0</w:t>
+      <w:t>Local health research evidence extraction platform  |  Version 2.0</w:t>
     </w:r>
   </w:p>
 </w:ftr>

</xml_diff>